<commit_message>
Update disclosure and vascular reference
</commit_message>
<xml_diff>
--- a/v2/manuscript/Feedback_selection_v2.docx
+++ b/v2/manuscript/Feedback_selection_v2.docx
@@ -1938,7 +1938,7 @@
     </w:p>
     <w:p>
       <w:r>
-        <w:t>Adaptive vascular research illustrates why the population of interest may change as a computational tool's intended use expands. Work on intelligent photonics and digital twins connects intravascular imaging with computational representations of vascular care,[18] while AI-assisted screening of PLLA modifiers concerns candidate selection for vascular-device materials.[19] These examples motivate a research-governance question: when an objective moves from technical screening toward decisions affecting patients or clinical workflows, whose constraints can enter its revision and evaluation?</w:t>
+        <w:t>Adaptive vascular research illustrates why the population of interest may change as a computational tool's intended use expands. Work on intelligent photonics and digital twins connects intravascular imaging with computational representations of vascular care,[18] while AI-assisted screening of PLLA modifiers concerns candidate selection for vascular-device materials.[19] These examples motivate a research-governance question: when an objective moves from technical screening toward decisions affecting patients or clinical workflows, whose constraints can enter its revision and evaluation? Recent nationwide outcome research in acute myocardial infarction also illustrates the scale and confounding structure of real-world interventional data to which these governance questions could eventually be applied.[20]</w:t>
       </w:r>
     </w:p>
     <w:p>
@@ -2021,7 +2021,7 @@
     </w:p>
     <w:p>
       <w:r>
-        <w:t>OpenAI Codex assisted with literature retrieval, manuscript drafting, programming, execution, mathematical checks, figure preparation and internal review. Multiple AI agents independently inspected results and challenged one another's interpretations. This internal process is not external peer review. Numerical findings were obtained by executing the supplied code and are distinguished from untested hypotheses. AI tools are not authors; accountability for the submitted work remains with its human authors.</w:t>
+        <w:t>OpenAI Codex assisted with literature review, manuscript drafting, coding, simulation development, figure preparation, and language editing. The human authors are responsible for the final manuscript and its conclusions.</w:t>
       </w:r>
     </w:p>
     <w:p>
@@ -2632,6 +2632,32 @@
         </w:rPr>
       </w:r>
     </w:p>
+    <w:p>
+      <w:pPr>
+        <w:keepLines/>
+        <w:spacing w:line="252" w:lineRule="auto" w:after="80"/>
+      </w:pPr>
+      <w:r>
+        <w:rPr>
+          <w:sz w:val="18"/>
+        </w:rPr>
+        <w:t xml:space="preserve">[20] You L, Li H, Lu Z, Wang Y, Hong S, Wang M, Zang T, Huang L, Shen L, Ge J. Intra-aortic balloon pump use and in-hospital mortality in acute myocardial infarction with Killip class III or IV: a nationwide cohort study. Biomarker Research. 2026;14:97. </w:t>
+      </w:r>
+      <w:hyperlink r:id="rId37">
+        <w:r>
+          <w:rPr>
+            <w:color w:val="17354C"/>
+            <w:sz w:val="18"/>
+          </w:rPr>
+          <w:t>https://doi.org/10.1186/s40364-026-00993-1</w:t>
+        </w:r>
+      </w:hyperlink>
+      <w:r>
+        <w:rPr>
+          <w:sz w:val="18"/>
+        </w:rPr>
+      </w:r>
+    </w:p>
     <w:sectPr>
       <w:footerReference w:type="default" r:id="rId9"/>
       <w:pgSz w:w="12240" w:h="15840"/>

</xml_diff>

<commit_message>
Add funding acknowledgement and disclosure
</commit_message>
<xml_diff>
--- a/v2/manuscript/Feedback_selection_v2.docx
+++ b/v2/manuscript/Feedback_selection_v2.docx
@@ -2016,12 +2016,25 @@
         <w:pStyle w:val="Heading1"/>
       </w:pPr>
       <w:r>
+        <w:t>Acknowledgements</w:t>
+      </w:r>
+    </w:p>
+    <w:p>
+      <w:r>
+        <w:t>This project was supported by the National Natural Science Foundation of China (T2288101, 82170342) and Medical Engineering Joint Fund of Fudan University (yg2023-01). The language of this article has been polished with the assistance of AI-based language tools.</w:t>
+      </w:r>
+    </w:p>
+    <w:p>
+      <w:pPr>
+        <w:pStyle w:val="Heading1"/>
+      </w:pPr>
+      <w:r>
         <w:t>Use of generative AI</w:t>
       </w:r>
     </w:p>
     <w:p>
       <w:r>
-        <w:t>OpenAI Codex assisted with literature review, manuscript drafting, coding, simulation development, figure preparation, and language editing. The human authors are responsible for the final manuscript and its conclusions.</w:t>
+        <w:t>OpenAI Codex assisted with literature review, drafting, coding, simulations, figure preparation, and language editing; the authors are responsible for the final manuscript and its conclusions.</w:t>
       </w:r>
     </w:p>
     <w:p>

</xml_diff>

<commit_message>
Add Xinyu Zhong and publish seven-author v0.2.4
</commit_message>
<xml_diff>
--- a/v2/manuscript/Feedback_selection_v2.docx
+++ b/v2/manuscript/Feedback_selection_v2.docx
@@ -22,7 +22,71 @@
           <w:sz w:val="16"/>
           <w:vertAlign w:val="superscript"/>
         </w:rPr>
-        <w:t>1,2,3,4</w:t>
+        <w:t>1,2,†</w:t>
+      </w:r>
+      <w:r>
+        <w:t xml:space="preserve">, </w:t>
+      </w:r>
+      <w:r>
+        <w:rPr>
+          <w:b/>
+        </w:rPr>
+        <w:t>Yujun Guo</w:t>
+      </w:r>
+      <w:r>
+        <w:rPr>
+          <w:sz w:val="16"/>
+          <w:vertAlign w:val="superscript"/>
+        </w:rPr>
+        <w:t>3,†</w:t>
+      </w:r>
+      <w:r>
+        <w:t xml:space="preserve">, </w:t>
+      </w:r>
+      <w:r>
+        <w:rPr>
+          <w:b/>
+        </w:rPr>
+        <w:t>Xinyu Zhong</w:t>
+      </w:r>
+      <w:r>
+        <w:rPr>
+          <w:sz w:val="16"/>
+          <w:vertAlign w:val="superscript"/>
+        </w:rPr>
+        <w:t>4,†</w:t>
+      </w:r>
+      <w:r>
+        <w:t xml:space="preserve">, </w:t>
+      </w:r>
+      <w:r>
+        <w:rPr>
+          <w:b/>
+        </w:rPr>
+        <w:t>Zisu Peng</w:t>
+      </w:r>
+      <w:r>
+        <w:rPr>
+          <w:sz w:val="16"/>
+          <w:vertAlign w:val="superscript"/>
+        </w:rPr>
+        <w:t>1,2,†</w:t>
+      </w:r>
+      <w:r>
+        <w:t xml:space="preserve">, </w:t>
+      </w:r>
+      <w:r>
+        <w:rPr>
+          <w:b/>
+        </w:rPr>
+        <w:t>Wentong Wang</w:t>
+      </w:r>
+      <w:r>
+        <w:rPr>
+          <w:sz w:val="16"/>
+          <w:vertAlign w:val="superscript"/>
+        </w:rPr>
+        <w:t>1,2,†</w:t>
       </w:r>
       <w:r>
         <w:t xml:space="preserve">, </w:t>
@@ -38,7 +102,7 @@
           <w:sz w:val="16"/>
           <w:vertAlign w:val="superscript"/>
         </w:rPr>
-        <w:t>1,2,3,4,*</w:t>
+        <w:t>1,2,*</w:t>
       </w:r>
       <w:r>
         <w:t xml:space="preserve">, </w:t>
@@ -54,7 +118,7 @@
           <w:sz w:val="16"/>
           <w:vertAlign w:val="superscript"/>
         </w:rPr>
-        <w:t>1,2,3,4,*</w:t>
+        <w:t>1,2,*</w:t>
       </w:r>
     </w:p>
     <w:p>
@@ -65,7 +129,7 @@
         <w:rPr>
           <w:sz w:val="16"/>
         </w:rPr>
-        <w:t>1 Department of Cardiology, Zhongshan Hospital, Fudan University, Shanghai Institute of Cardiovascular Diseases, Shanghai 200032, China.</w:t>
+        <w:t>1 Department of Cardiology, Zhongshan Hospital, Fudan University, Shanghai Institute of Cardiovascular Diseases, State Key Laboratory of Cardiovascular Diseases, NHC Key Laboratory of Ischemic Heart Diseases China, National Clinical Research Center for Interventional Medicine, Key Laboratory of Viral Heart Diseases, Chinese Academy of Medical Sciences, Shanghai 200032, China.</w:t>
       </w:r>
     </w:p>
     <w:p>
@@ -76,7 +140,7 @@
         <w:rPr>
           <w:sz w:val="16"/>
         </w:rPr>
-        <w:t>2 National Clinical Research Center for Interventional Medicine, Shanghai 200032, China.</w:t>
+        <w:t>2 Institutes of Biomedical Sciences, Fudan University, Shanghai 200030, China.</w:t>
       </w:r>
     </w:p>
     <w:p>
@@ -87,7 +151,7 @@
         <w:rPr>
           <w:sz w:val="16"/>
         </w:rPr>
-        <w:t>3 State Key Laboratory of Cardiovascular Diseases, Zhongshan Hospital, Fudan University, Shanghai 200032, China.</w:t>
+        <w:t>3 College of Biomedical Engineering, Fudan University, Shanghai 200438, China.</w:t>
       </w:r>
     </w:p>
     <w:p>
@@ -98,7 +162,7 @@
         <w:rPr>
           <w:sz w:val="16"/>
         </w:rPr>
-        <w:t>4 University of Shanghai for Science and Technology, Oriental Pan-Vascular Devices Innovation College, Shanghai 200093, China.</w:t>
+        <w:t>4 Department of Cardiology, Shidong Hospital, Yangpu District, Shanghai 200438, China.</w:t>
       </w:r>
     </w:p>
     <w:p>
@@ -109,9 +173,9 @@
         <w:rPr>
           <w:sz w:val="16"/>
         </w:rPr>
-        <w:t>Lingsen You: lingsenyou@gmail.com.</w:t>
+        <w:t>Lingsen You: lingsenyou@gmail.com; Xinyu Zhong: XYzhou1998@outlook.com.</w:t>
         <w:br/>
-        <w:t>* Corresponding authors: Li Shen (shen_li@fudan.edu.cn) and Junbo Ge (jbge@zs-hospital.sh.cn).</w:t>
+        <w:t>† Equal contribution. * Corresponding authors: Li Shen (shen_li@fudan.edu.cn) and Junbo Ge (jbge@zs-hospital.sh.cn).</w:t>
       </w:r>
     </w:p>
     <w:p>

</xml_diff>